<commit_message>
Finished my report for the third week.
</commit_message>
<xml_diff>
--- a/Weekly reports/Week 3/Report.docx
+++ b/Weekly reports/Week 3/Report.docx
@@ -2,7 +2,903 @@
 <file path=word/document.xml><?xml version="1.0" encoding="utf-8"?>
 <w:document xmlns:wpc="http://schemas.microsoft.com/office/word/2010/wordprocessingCanvas" xmlns:cx="http://schemas.microsoft.com/office/drawing/2014/chartex" xmlns:cx1="http://schemas.microsoft.com/office/drawing/2015/9/8/chartex" xmlns:cx2="http://schemas.microsoft.com/office/drawing/2015/10/21/chartex" xmlns:cx3="http://schemas.microsoft.com/office/drawing/2016/5/9/chartex" xmlns:cx4="http://schemas.microsoft.com/office/drawing/2016/5/10/chartex" xmlns:cx5="http://schemas.microsoft.com/office/drawing/2016/5/11/chartex" xmlns:cx6="http://schemas.microsoft.com/office/drawing/2016/5/12/chartex" xmlns:cx7="http://schemas.microsoft.com/office/drawing/2016/5/13/chartex" xmlns:cx8="http://schemas.microsoft.com/office/drawing/2016/5/14/chartex" xmlns:mc="http://schemas.openxmlformats.org/markup-compatibility/2006" xmlns:aink="http://schemas.microsoft.com/office/drawing/2016/ink" xmlns:am3d="http://schemas.microsoft.com/office/drawing/2017/model3d" xmlns:o="urn:schemas-microsoft-com:office:office" xmlns:oel="http://schemas.microsoft.com/office/2019/extlst" xmlns:r="http://schemas.openxmlformats.org/officeDocument/2006/relationships" xmlns:m="http://schemas.openxmlformats.org/officeDocument/2006/math" xmlns:v="urn:schemas-microsoft-com:vml" xmlns:wp14="http://schemas.microsoft.com/office/word/2010/wordprocessingDrawing" xmlns:wp="http://schemas.openxmlformats.org/drawingml/2006/wordprocessingDrawing" xmlns:w10="urn:schemas-microsoft-com:office:word" xmlns:w="http://schemas.openxmlformats.org/wordprocessingml/2006/main" xmlns:w14="http://schemas.microsoft.com/office/word/2010/wordml" xmlns:w15="http://schemas.microsoft.com/office/word/2012/wordml" xmlns:w16cex="http://schemas.microsoft.com/office/word/2018/wordml/cex" xmlns:w16cid="http://schemas.microsoft.com/office/word/2016/wordml/cid" xmlns:w16="http://schemas.microsoft.com/office/word/2018/wordml" xmlns:w16du="http://schemas.microsoft.com/office/word/2023/wordml/word16du" xmlns:w16sdtdh="http://schemas.microsoft.com/office/word/2020/wordml/sdtdatahash" xmlns:w16sdtfl="http://schemas.microsoft.com/office/word/2024/wordml/sdtformatlock" xmlns:w16se="http://schemas.microsoft.com/office/word/2015/wordml/symex" xmlns:wpg="http://schemas.microsoft.com/office/word/2010/wordprocessingGroup" xmlns:wpi="http://schemas.microsoft.com/office/word/2010/wordprocessingInk" xmlns:wne="http://schemas.microsoft.com/office/word/2006/wordml" xmlns:wps="http://schemas.microsoft.com/office/word/2010/wordprocessingShape" mc:Ignorable="w14 w15 w16se w16cid w16 w16cex w16sdtdh w16sdtfl w16du wp14">
   <w:body>
-    <w:p/>
+    <w:p>
+      <w:pPr>
+        <w:rPr>
+          <w:lang w:val="en-US"/>
+        </w:rPr>
+      </w:pPr>
+      <w:r>
+        <w:rPr>
+          <w:lang w:val="en-US"/>
+        </w:rPr>
+        <w:t>During this week,</w:t>
+      </w:r>
+      <w:r>
+        <w:rPr>
+          <w:lang w:val="en-US"/>
+        </w:rPr>
+        <w:t xml:space="preserve"> I continued the development</w:t>
+      </w:r>
+      <w:r>
+        <w:rPr>
+          <w:lang w:val="en-US"/>
+        </w:rPr>
+        <w:t xml:space="preserve"> of the AUBG</w:t>
+      </w:r>
+      <w:r>
+        <w:rPr>
+          <w:lang w:val="en-US"/>
+        </w:rPr>
+        <w:t xml:space="preserve"> Academic Progress Tracker</w:t>
+      </w:r>
+      <w:r>
+        <w:rPr>
+          <w:lang w:val="en-US"/>
+        </w:rPr>
+        <w:t xml:space="preserve"> and complete</w:t>
+      </w:r>
+      <w:r>
+        <w:rPr>
+          <w:lang w:val="en-US"/>
+        </w:rPr>
+        <w:t>d the next</w:t>
+      </w:r>
+      <w:r>
+        <w:rPr>
+          <w:lang w:val="en-US"/>
+        </w:rPr>
+        <w:t xml:space="preserve"> major project stage</w:t>
+      </w:r>
+      <w:r>
+        <w:rPr>
+          <w:lang w:val="en-US"/>
+        </w:rPr>
+        <w:t>.</w:t>
+      </w:r>
+      <w:r>
+        <w:rPr>
+          <w:lang w:val="en-US"/>
+        </w:rPr>
+        <w:t xml:space="preserve"> The main programming task</w:t>
+      </w:r>
+      <w:r>
+        <w:rPr>
+          <w:lang w:val="en-US"/>
+        </w:rPr>
+        <w:t xml:space="preserve"> was the implementation</w:t>
+      </w:r>
+      <w:r>
+        <w:rPr>
+          <w:lang w:val="en-US"/>
+        </w:rPr>
+        <w:t xml:space="preserve"> of the What-if</w:t>
+      </w:r>
+      <w:r>
+        <w:rPr>
+          <w:lang w:val="en-US"/>
+        </w:rPr>
+        <w:t xml:space="preserve"> GPA Calculator</w:t>
+      </w:r>
+      <w:r>
+        <w:rPr>
+          <w:lang w:val="en-US"/>
+        </w:rPr>
+        <w:t>.</w:t>
+      </w:r>
+      <w:r>
+        <w:rPr>
+          <w:lang w:val="en-US"/>
+        </w:rPr>
+        <w:t xml:space="preserve"> I also continued</w:t>
+      </w:r>
+      <w:r>
+        <w:rPr>
+          <w:lang w:val="en-US"/>
+        </w:rPr>
+        <w:t xml:space="preserve"> working</w:t>
+      </w:r>
+      <w:r>
+        <w:rPr>
+          <w:lang w:val="en-US"/>
+        </w:rPr>
+        <w:t xml:space="preserve"> on</w:t>
+      </w:r>
+      <w:r>
+        <w:rPr>
+          <w:lang w:val="en-US"/>
+        </w:rPr>
+        <w:t xml:space="preserve"> the written thesis</w:t>
+      </w:r>
+      <w:r>
+        <w:rPr>
+          <w:lang w:val="en-US"/>
+        </w:rPr>
+        <w:t xml:space="preserve"> and transferred</w:t>
+      </w:r>
+      <w:r>
+        <w:rPr>
+          <w:lang w:val="en-US"/>
+        </w:rPr>
+        <w:t xml:space="preserve"> additional parts</w:t>
+      </w:r>
+      <w:r>
+        <w:rPr>
+          <w:lang w:val="en-US"/>
+        </w:rPr>
+        <w:t xml:space="preserve"> of the Design of</w:t>
+      </w:r>
+      <w:r>
+        <w:rPr>
+          <w:lang w:val="en-US"/>
+        </w:rPr>
+        <w:t xml:space="preserve"> Software Solution</w:t>
+      </w:r>
+      <w:r>
+        <w:rPr>
+          <w:lang w:val="en-US"/>
+        </w:rPr>
+        <w:t xml:space="preserve"> section into</w:t>
+      </w:r>
+      <w:r>
+        <w:rPr>
+          <w:lang w:val="en-US"/>
+        </w:rPr>
+        <w:t xml:space="preserve"> the final</w:t>
+      </w:r>
+      <w:r>
+        <w:rPr>
+          <w:lang w:val="en-US"/>
+        </w:rPr>
+        <w:t xml:space="preserve"> Microsoft</w:t>
+      </w:r>
+      <w:r>
+        <w:rPr>
+          <w:lang w:val="en-US"/>
+        </w:rPr>
+        <w:t xml:space="preserve"> Word document.</w:t>
+      </w:r>
+    </w:p>
+    <w:p>
+      <w:pPr>
+        <w:rPr>
+          <w:lang w:val="en-US"/>
+        </w:rPr>
+      </w:pPr>
+    </w:p>
+    <w:p>
+      <w:pPr>
+        <w:rPr>
+          <w:lang w:val="en-US"/>
+        </w:rPr>
+      </w:pPr>
+      <w:r>
+        <w:rPr>
+          <w:lang w:val="en-US"/>
+        </w:rPr>
+        <w:t>The What-if GPA Calculator</w:t>
+      </w:r>
+      <w:r>
+        <w:rPr>
+          <w:lang w:val="en-US"/>
+        </w:rPr>
+        <w:t xml:space="preserve"> allows the user to</w:t>
+      </w:r>
+      <w:r>
+        <w:rPr>
+          <w:lang w:val="en-US"/>
+        </w:rPr>
+        <w:t xml:space="preserve"> simulate how future</w:t>
+      </w:r>
+      <w:r>
+        <w:rPr>
+          <w:lang w:val="en-US"/>
+        </w:rPr>
+        <w:t xml:space="preserve"> courses and grades</w:t>
+      </w:r>
+      <w:r>
+        <w:rPr>
+          <w:lang w:val="en-US"/>
+        </w:rPr>
+        <w:t xml:space="preserve"> could affect the</w:t>
+      </w:r>
+      <w:r>
+        <w:rPr>
+          <w:lang w:val="en-US"/>
+        </w:rPr>
+        <w:t xml:space="preserve"> cumulative GPA</w:t>
+      </w:r>
+      <w:r>
+        <w:rPr>
+          <w:lang w:val="en-US"/>
+        </w:rPr>
+        <w:t xml:space="preserve"> without modifying</w:t>
+      </w:r>
+      <w:r>
+        <w:rPr>
+          <w:lang w:val="en-US"/>
+        </w:rPr>
+        <w:t xml:space="preserve"> the real</w:t>
+      </w:r>
+      <w:r>
+        <w:rPr>
+          <w:lang w:val="en-US"/>
+        </w:rPr>
+        <w:t xml:space="preserve"> academic</w:t>
+      </w:r>
+      <w:r>
+        <w:rPr>
+          <w:lang w:val="en-US"/>
+        </w:rPr>
+        <w:t xml:space="preserve"> record stored</w:t>
+      </w:r>
+      <w:r>
+        <w:rPr>
+          <w:lang w:val="en-US"/>
+        </w:rPr>
+        <w:t xml:space="preserve"> in the database.</w:t>
+      </w:r>
+      <w:r>
+        <w:rPr>
+          <w:lang w:val="en-US"/>
+        </w:rPr>
+        <w:t xml:space="preserve"> For this functionality</w:t>
+      </w:r>
+      <w:r>
+        <w:rPr>
+          <w:lang w:val="en-US"/>
+        </w:rPr>
+        <w:t>, I created a separate</w:t>
+      </w:r>
+      <w:r>
+        <w:rPr>
+          <w:lang w:val="en-US"/>
+        </w:rPr>
+        <w:t xml:space="preserve"> </w:t>
+      </w:r>
+      <w:proofErr w:type="spellStart"/>
+      <w:r>
+        <w:rPr>
+          <w:lang w:val="en-US"/>
+        </w:rPr>
+        <w:t>WhatIfCourse</w:t>
+      </w:r>
+      <w:proofErr w:type="spellEnd"/>
+      <w:r>
+        <w:rPr>
+          <w:lang w:val="en-US"/>
+        </w:rPr>
+        <w:t xml:space="preserve"> model</w:t>
+      </w:r>
+      <w:r>
+        <w:rPr>
+          <w:lang w:val="en-US"/>
+        </w:rPr>
+        <w:t xml:space="preserve"> representing hypothetical courses</w:t>
+      </w:r>
+      <w:r>
+        <w:rPr>
+          <w:lang w:val="en-US"/>
+        </w:rPr>
+        <w:t>.</w:t>
+      </w:r>
+      <w:r>
+        <w:rPr>
+          <w:lang w:val="en-US"/>
+        </w:rPr>
+        <w:t xml:space="preserve"> These courses contain a course</w:t>
+      </w:r>
+      <w:r>
+        <w:rPr>
+          <w:lang w:val="en-US"/>
+        </w:rPr>
+        <w:t xml:space="preserve"> name, number of</w:t>
+      </w:r>
+      <w:r>
+        <w:rPr>
+          <w:lang w:val="en-US"/>
+        </w:rPr>
+        <w:t xml:space="preserve"> credits,</w:t>
+      </w:r>
+      <w:r>
+        <w:rPr>
+          <w:lang w:val="en-US"/>
+        </w:rPr>
+        <w:t xml:space="preserve"> and expected grade</w:t>
+      </w:r>
+      <w:r>
+        <w:rPr>
+          <w:lang w:val="en-US"/>
+        </w:rPr>
+        <w:t>, but they are not</w:t>
+      </w:r>
+      <w:r>
+        <w:rPr>
+          <w:lang w:val="en-US"/>
+        </w:rPr>
+        <w:t xml:space="preserve"> stored through</w:t>
+      </w:r>
+      <w:r>
+        <w:rPr>
+          <w:lang w:val="en-US"/>
+        </w:rPr>
+        <w:t xml:space="preserve"> Entity Framework Core</w:t>
+      </w:r>
+      <w:r>
+        <w:rPr>
+          <w:lang w:val="en-US"/>
+        </w:rPr>
+        <w:t xml:space="preserve"> and do not become</w:t>
+      </w:r>
+      <w:r>
+        <w:rPr>
+          <w:lang w:val="en-US"/>
+        </w:rPr>
+        <w:t xml:space="preserve"> part of the</w:t>
+      </w:r>
+      <w:r>
+        <w:rPr>
+          <w:lang w:val="en-US"/>
+        </w:rPr>
+        <w:t xml:space="preserve"> SQLite database.</w:t>
+      </w:r>
+    </w:p>
+    <w:p>
+      <w:pPr>
+        <w:rPr>
+          <w:lang w:val="en-US"/>
+        </w:rPr>
+      </w:pPr>
+    </w:p>
+    <w:p>
+      <w:pPr>
+        <w:rPr>
+          <w:lang w:val="en-US"/>
+        </w:rPr>
+      </w:pPr>
+      <w:r>
+        <w:rPr>
+          <w:lang w:val="en-US"/>
+        </w:rPr>
+        <w:t>I also implemented</w:t>
+      </w:r>
+      <w:r>
+        <w:rPr>
+          <w:lang w:val="en-US"/>
+        </w:rPr>
+        <w:t xml:space="preserve"> a dedicated</w:t>
+      </w:r>
+      <w:r>
+        <w:rPr>
+          <w:lang w:val="en-US"/>
+        </w:rPr>
+        <w:t xml:space="preserve"> calculation service</w:t>
+      </w:r>
+      <w:r>
+        <w:rPr>
+          <w:lang w:val="en-US"/>
+        </w:rPr>
+        <w:t xml:space="preserve"> for projected GPA values</w:t>
+      </w:r>
+      <w:r>
+        <w:rPr>
+          <w:lang w:val="en-US"/>
+        </w:rPr>
+        <w:t>. The calculator combines</w:t>
+      </w:r>
+      <w:r>
+        <w:rPr>
+          <w:lang w:val="en-US"/>
+        </w:rPr>
+        <w:t xml:space="preserve"> the quality points</w:t>
+      </w:r>
+      <w:r>
+        <w:rPr>
+          <w:lang w:val="en-US"/>
+        </w:rPr>
+        <w:t xml:space="preserve"> and attempted credits</w:t>
+      </w:r>
+      <w:r>
+        <w:rPr>
+          <w:lang w:val="en-US"/>
+        </w:rPr>
+        <w:t xml:space="preserve"> from the existing stored</w:t>
+      </w:r>
+      <w:r>
+        <w:rPr>
+          <w:lang w:val="en-US"/>
+        </w:rPr>
+        <w:t xml:space="preserve"> courses with</w:t>
+      </w:r>
+      <w:r>
+        <w:rPr>
+          <w:lang w:val="en-US"/>
+        </w:rPr>
+        <w:t xml:space="preserve"> those of the</w:t>
+      </w:r>
+      <w:r>
+        <w:rPr>
+          <w:lang w:val="en-US"/>
+        </w:rPr>
+        <w:t xml:space="preserve"> hypothetical courses.</w:t>
+      </w:r>
+      <w:r>
+        <w:rPr>
+          <w:lang w:val="en-US"/>
+        </w:rPr>
+        <w:t xml:space="preserve"> This makes it possible</w:t>
+      </w:r>
+      <w:r>
+        <w:rPr>
+          <w:lang w:val="en-US"/>
+        </w:rPr>
+        <w:t xml:space="preserve"> to calculate a</w:t>
+      </w:r>
+      <w:r>
+        <w:rPr>
+          <w:lang w:val="en-US"/>
+        </w:rPr>
+        <w:t xml:space="preserve"> projected cumulative GPA</w:t>
+      </w:r>
+      <w:r>
+        <w:rPr>
+          <w:lang w:val="en-US"/>
+        </w:rPr>
+        <w:t xml:space="preserve"> while preserving the student’s</w:t>
+      </w:r>
+      <w:r>
+        <w:rPr>
+          <w:lang w:val="en-US"/>
+        </w:rPr>
+        <w:t xml:space="preserve"> current data.</w:t>
+      </w:r>
+      <w:r>
+        <w:rPr>
+          <w:lang w:val="en-US"/>
+        </w:rPr>
+        <w:t xml:space="preserve"> The What-if page</w:t>
+      </w:r>
+      <w:r>
+        <w:rPr>
+          <w:lang w:val="en-US"/>
+        </w:rPr>
+        <w:t xml:space="preserve"> displays both</w:t>
+      </w:r>
+      <w:r>
+        <w:rPr>
+          <w:lang w:val="en-US"/>
+        </w:rPr>
+        <w:t xml:space="preserve"> the current GPA</w:t>
+      </w:r>
+      <w:r>
+        <w:rPr>
+          <w:lang w:val="en-US"/>
+        </w:rPr>
+        <w:t xml:space="preserve"> and the projected GPA</w:t>
+      </w:r>
+      <w:r>
+        <w:rPr>
+          <w:lang w:val="en-US"/>
+        </w:rPr>
+        <w:t>, and the user can</w:t>
+      </w:r>
+      <w:r>
+        <w:rPr>
+          <w:lang w:val="en-US"/>
+        </w:rPr>
+        <w:t xml:space="preserve"> add multiple</w:t>
+      </w:r>
+      <w:r>
+        <w:rPr>
+          <w:lang w:val="en-US"/>
+        </w:rPr>
+        <w:t xml:space="preserve"> hypothetical courses</w:t>
+      </w:r>
+      <w:r>
+        <w:rPr>
+          <w:lang w:val="en-US"/>
+        </w:rPr>
+        <w:t>, remove individual entries</w:t>
+      </w:r>
+      <w:r>
+        <w:rPr>
+          <w:lang w:val="en-US"/>
+        </w:rPr>
+        <w:t>, or reset the</w:t>
+      </w:r>
+      <w:r>
+        <w:rPr>
+          <w:lang w:val="en-US"/>
+        </w:rPr>
+        <w:t xml:space="preserve"> complete hypothetical list.</w:t>
+      </w:r>
+      <w:r>
+        <w:rPr>
+          <w:lang w:val="en-US"/>
+        </w:rPr>
+        <w:t xml:space="preserve"> I tested the feature to</w:t>
+      </w:r>
+      <w:r>
+        <w:rPr>
+          <w:lang w:val="en-US"/>
+        </w:rPr>
+        <w:t xml:space="preserve"> confirm that</w:t>
+      </w:r>
+      <w:r>
+        <w:rPr>
+          <w:lang w:val="en-US"/>
+        </w:rPr>
+        <w:t xml:space="preserve"> hypothetical courses</w:t>
+      </w:r>
+      <w:r>
+        <w:rPr>
+          <w:lang w:val="en-US"/>
+        </w:rPr>
+        <w:t xml:space="preserve"> do not appear on</w:t>
+      </w:r>
+      <w:r>
+        <w:rPr>
+          <w:lang w:val="en-US"/>
+        </w:rPr>
+        <w:t xml:space="preserve"> the regular Courses page</w:t>
+      </w:r>
+      <w:r>
+        <w:rPr>
+          <w:lang w:val="en-US"/>
+        </w:rPr>
+        <w:t xml:space="preserve"> and disappear after</w:t>
+      </w:r>
+      <w:r>
+        <w:rPr>
+          <w:lang w:val="en-US"/>
+        </w:rPr>
+        <w:t xml:space="preserve"> the program is restarted</w:t>
+      </w:r>
+      <w:r>
+        <w:rPr>
+          <w:lang w:val="en-US"/>
+        </w:rPr>
+        <w:t>.</w:t>
+      </w:r>
+    </w:p>
+    <w:p>
+      <w:pPr>
+        <w:rPr>
+          <w:lang w:val="en-US"/>
+        </w:rPr>
+      </w:pPr>
+    </w:p>
+    <w:p>
+      <w:pPr>
+        <w:rPr>
+          <w:lang w:val="en-US"/>
+        </w:rPr>
+      </w:pPr>
+      <w:r>
+        <w:rPr>
+          <w:lang w:val="en-US"/>
+        </w:rPr>
+        <w:t>During implementation,</w:t>
+      </w:r>
+      <w:r>
+        <w:rPr>
+          <w:lang w:val="en-US"/>
+        </w:rPr>
+        <w:t xml:space="preserve"> I encountered a</w:t>
+      </w:r>
+      <w:r>
+        <w:rPr>
+          <w:lang w:val="en-US"/>
+        </w:rPr>
+        <w:t xml:space="preserve"> naming conflict between</w:t>
+      </w:r>
+      <w:r>
+        <w:rPr>
+          <w:lang w:val="en-US"/>
+        </w:rPr>
+        <w:t xml:space="preserve"> the </w:t>
+      </w:r>
+      <w:proofErr w:type="spellStart"/>
+      <w:r>
+        <w:rPr>
+          <w:lang w:val="en-US"/>
+        </w:rPr>
+        <w:t>WhatIfCalculator</w:t>
+      </w:r>
+      <w:proofErr w:type="spellEnd"/>
+      <w:r>
+        <w:rPr>
+          <w:lang w:val="en-US"/>
+        </w:rPr>
+        <w:t xml:space="preserve"> Razor component</w:t>
+      </w:r>
+      <w:r>
+        <w:rPr>
+          <w:lang w:val="en-US"/>
+        </w:rPr>
+        <w:t xml:space="preserve"> and the service </w:t>
+      </w:r>
+      <w:r>
+        <w:rPr>
+          <w:lang w:val="en-US"/>
+        </w:rPr>
+        <w:t>class with</w:t>
+      </w:r>
+      <w:r>
+        <w:rPr>
+          <w:lang w:val="en-US"/>
+        </w:rPr>
+        <w:t xml:space="preserve"> the same name.</w:t>
+      </w:r>
+      <w:r>
+        <w:rPr>
+          <w:lang w:val="en-US"/>
+        </w:rPr>
+        <w:t xml:space="preserve"> I corrected the problem</w:t>
+      </w:r>
+      <w:r>
+        <w:rPr>
+          <w:lang w:val="en-US"/>
+        </w:rPr>
+        <w:t xml:space="preserve"> by distinguishing</w:t>
+      </w:r>
+      <w:r>
+        <w:rPr>
+          <w:lang w:val="en-US"/>
+        </w:rPr>
+        <w:t xml:space="preserve"> the service from</w:t>
+      </w:r>
+      <w:r>
+        <w:rPr>
+          <w:lang w:val="en-US"/>
+        </w:rPr>
+        <w:t xml:space="preserve"> the Razor</w:t>
+      </w:r>
+      <w:r>
+        <w:rPr>
+          <w:lang w:val="en-US"/>
+        </w:rPr>
+        <w:t xml:space="preserve"> component</w:t>
+      </w:r>
+      <w:r>
+        <w:rPr>
+          <w:lang w:val="en-US"/>
+        </w:rPr>
+        <w:t xml:space="preserve"> so that dependency injection</w:t>
+      </w:r>
+      <w:r>
+        <w:rPr>
+          <w:lang w:val="en-US"/>
+        </w:rPr>
+        <w:t xml:space="preserve"> could resolve</w:t>
+      </w:r>
+      <w:r>
+        <w:rPr>
+          <w:lang w:val="en-US"/>
+        </w:rPr>
+        <w:t xml:space="preserve"> the appropriate class.</w:t>
+      </w:r>
+    </w:p>
+    <w:p>
+      <w:pPr>
+        <w:rPr>
+          <w:lang w:val="en-US"/>
+        </w:rPr>
+      </w:pPr>
+    </w:p>
+    <w:p>
+      <w:pPr>
+        <w:rPr>
+          <w:lang w:val="en-US"/>
+        </w:rPr>
+      </w:pPr>
+      <w:r>
+        <w:rPr>
+          <w:lang w:val="en-US"/>
+        </w:rPr>
+        <w:t>I also added</w:t>
+      </w:r>
+      <w:r>
+        <w:rPr>
+          <w:lang w:val="en-US"/>
+        </w:rPr>
+        <w:t xml:space="preserve"> </w:t>
+      </w:r>
+      <w:proofErr w:type="gramStart"/>
+      <w:r>
+        <w:rPr>
+          <w:lang w:val="en-US"/>
+        </w:rPr>
+        <w:t>a .</w:t>
+      </w:r>
+      <w:proofErr w:type="spellStart"/>
+      <w:r>
+        <w:rPr>
+          <w:lang w:val="en-US"/>
+        </w:rPr>
+        <w:t>gitignore</w:t>
+      </w:r>
+      <w:proofErr w:type="spellEnd"/>
+      <w:proofErr w:type="gramEnd"/>
+      <w:r>
+        <w:rPr>
+          <w:lang w:val="en-US"/>
+        </w:rPr>
+        <w:t xml:space="preserve"> file to the Git repository</w:t>
+      </w:r>
+      <w:r>
+        <w:rPr>
+          <w:lang w:val="en-US"/>
+        </w:rPr>
+        <w:t>.</w:t>
+      </w:r>
+      <w:r>
+        <w:rPr>
+          <w:lang w:val="en-US"/>
+        </w:rPr>
+        <w:t xml:space="preserve"> The local SQLite</w:t>
+      </w:r>
+      <w:r>
+        <w:rPr>
+          <w:lang w:val="en-US"/>
+        </w:rPr>
+        <w:t xml:space="preserve"> database and</w:t>
+      </w:r>
+      <w:r>
+        <w:rPr>
+          <w:lang w:val="en-US"/>
+        </w:rPr>
+        <w:t xml:space="preserve"> temporary database files</w:t>
+      </w:r>
+      <w:r>
+        <w:rPr>
+          <w:lang w:val="en-US"/>
+        </w:rPr>
+        <w:t xml:space="preserve"> are now ignored by Git</w:t>
+      </w:r>
+      <w:r>
+        <w:rPr>
+          <w:lang w:val="en-US"/>
+        </w:rPr>
+        <w:t>, while the migration</w:t>
+      </w:r>
+      <w:r>
+        <w:rPr>
+          <w:lang w:val="en-US"/>
+        </w:rPr>
+        <w:t xml:space="preserve"> files remain</w:t>
+      </w:r>
+      <w:r>
+        <w:rPr>
+          <w:lang w:val="en-US"/>
+        </w:rPr>
+        <w:t xml:space="preserve"> </w:t>
+      </w:r>
+      <w:proofErr w:type="gramStart"/>
+      <w:r>
+        <w:rPr>
+          <w:lang w:val="en-US"/>
+        </w:rPr>
+        <w:t>version-controlled</w:t>
+      </w:r>
+      <w:proofErr w:type="gramEnd"/>
+      <w:r>
+        <w:rPr>
+          <w:lang w:val="en-US"/>
+        </w:rPr>
+        <w:t>.</w:t>
+      </w:r>
+      <w:r>
+        <w:rPr>
+          <w:lang w:val="en-US"/>
+        </w:rPr>
+        <w:t xml:space="preserve"> This keeps local test</w:t>
+      </w:r>
+      <w:r>
+        <w:rPr>
+          <w:lang w:val="en-US"/>
+        </w:rPr>
+        <w:t xml:space="preserve"> data out of</w:t>
+      </w:r>
+      <w:r>
+        <w:rPr>
+          <w:lang w:val="en-US"/>
+        </w:rPr>
+        <w:t xml:space="preserve"> the repository while</w:t>
+      </w:r>
+      <w:r>
+        <w:rPr>
+          <w:lang w:val="en-US"/>
+        </w:rPr>
+        <w:t xml:space="preserve"> preserving the code</w:t>
+      </w:r>
+      <w:r>
+        <w:rPr>
+          <w:lang w:val="en-US"/>
+        </w:rPr>
+        <w:t xml:space="preserve"> required to recreate</w:t>
+      </w:r>
+      <w:r>
+        <w:rPr>
+          <w:lang w:val="en-US"/>
+        </w:rPr>
+        <w:t xml:space="preserve"> the database structure.</w:t>
+      </w:r>
+    </w:p>
+    <w:p>
+      <w:pPr>
+        <w:rPr>
+          <w:lang w:val="en-US"/>
+        </w:rPr>
+      </w:pPr>
+    </w:p>
+    <w:p>
+      <w:pPr>
+        <w:rPr>
+          <w:lang w:val="en-US"/>
+        </w:rPr>
+      </w:pPr>
+      <w:r>
+        <w:rPr>
+          <w:lang w:val="en-US"/>
+        </w:rPr>
+        <w:t>In addition to</w:t>
+      </w:r>
+      <w:r>
+        <w:rPr>
+          <w:lang w:val="en-US"/>
+        </w:rPr>
+        <w:t xml:space="preserve"> programming,</w:t>
+      </w:r>
+      <w:r>
+        <w:rPr>
+          <w:lang w:val="en-US"/>
+        </w:rPr>
+        <w:t xml:space="preserve"> I continued writing</w:t>
+      </w:r>
+      <w:r>
+        <w:rPr>
+          <w:lang w:val="en-US"/>
+        </w:rPr>
+        <w:t xml:space="preserve"> the thesis and </w:t>
+      </w:r>
+      <w:r>
+        <w:rPr>
+          <w:lang w:val="en-US"/>
+        </w:rPr>
+        <w:t>transferred</w:t>
+      </w:r>
+      <w:r>
+        <w:rPr>
+          <w:lang w:val="en-US"/>
+        </w:rPr>
+        <w:t xml:space="preserve"> more material from</w:t>
+      </w:r>
+      <w:r>
+        <w:rPr>
+          <w:lang w:val="en-US"/>
+        </w:rPr>
+        <w:t xml:space="preserve"> Part 3, </w:t>
+      </w:r>
+      <w:r>
+        <w:rPr>
+          <w:lang w:val="en-US"/>
+        </w:rPr>
+        <w:t>Design of Software Solution</w:t>
+      </w:r>
+      <w:r>
+        <w:rPr>
+          <w:lang w:val="en-US"/>
+        </w:rPr>
+        <w:t>, into the formatted</w:t>
+      </w:r>
+      <w:r>
+        <w:rPr>
+          <w:lang w:val="en-US"/>
+        </w:rPr>
+        <w:t xml:space="preserve"> Word document.</w:t>
+      </w:r>
+    </w:p>
     <w:sectPr>
       <w:pgSz w:w="11906" w:h="16838"/>
       <w:pgMar w:top="1417" w:right="1417" w:bottom="1417" w:left="1417" w:header="708" w:footer="708" w:gutter="0"/>

</xml_diff>